<commit_message>
Add missing Daftar Pustaka and fix UML section in Bab 2
Bab 2 was missing its bibliography section entirely despite citing
20 sources throughout the chapter; add it back with full Harvard-style
entries. Also add a UML notation symbol table to the existing UML
subsection, fix a citation that used "et al." on its only occurrence
(should list all four authors per campus citation rules), and correct
a stale cross-reference claiming diagrams live in Bab IV when they
were moved to Bab III.
</commit_message>
<xml_diff>
--- a/penulisan/BAB_2_TINJAUAN_PUSTAKA.docx
+++ b/penulisan/BAB_2_TINJAUAN_PUSTAKA.docx
@@ -104,9 +104,9 @@
         <w:jc w:val="both"/>
       </w:pPr>
       <w:r>
-        <w:t xml:space="preserve">Point of Sale (POS) adalah sistem yang digunakan untuk menangani proses transaksi penjualan pada titik terjadinya pembayaran. POS tidak hanya berfungsi </w:t>
+        <w:t xml:space="preserve">Point of Sale (POS) adalah sistem yang digunakan untuk menangani proses transaksi penjualan pada titik terjadinya pembayaran. POS berfungsi lebih luas </w:t>
         <w:lastRenderedPageBreak/>
-        <w:t xml:space="preserve">sebagai alat penghitung total pembayaran, tetapi juga dapat digunakan untuk mencatat transaksi, mencetak struk, mengelola stok, dan menghasilkan laporan penjualan. Penelitian </w:t>
+        <w:t xml:space="preserve">daripada sekadar alat penghitung total pembayaran: sistem ini juga mencatat transaksi, mencetak struk, mengelola stok, dan menghasilkan laporan penjualan. Penelitian </w:t>
       </w:r>
       <w:sdt>
         <w:sdtPr>
@@ -217,7 +217,7 @@
         <w:jc w:val="both"/>
       </w:pPr>
       <w:r>
-        <w:t xml:space="preserve">Pengelolaan stok adalah proses pencatatan dan pengendalian persediaan agar jumlah barang atau bahan yang tersedia dapat diketahui secara akurat. Pada usaha makanan dan minuman, stok tidak hanya berupa produk akhir, tetapi juga bahan baku yang digunakan untuk membuat produk. Oleh karena itu, pengelolaan stok perlu mempertimbangkan resep produk agar sistem dapat menghitung pengurangan bahan baku berdasarkan jumlah produk yang terjual.</w:t>
+        <w:t xml:space="preserve">Pengelolaan stok adalah proses pencatatan dan pengendalian persediaan agar jumlah barang atau bahan yang tersedia dapat diketahui secara akurat. Pada usaha makanan dan minuman, stok mencakup produk akhir maupun bahan baku yang dipakai untuk membuat produk itu sendiri. Oleh karena itu, pengelolaan stok perlu mempertimbangkan resep produk agar sistem dapat menghitung pengurangan bahan baku berdasarkan jumlah produk yang terjual.</w:t>
       </w:r>
     </w:p>
     <w:p>
@@ -662,7 +662,7 @@
         <w:jc w:val="both"/>
       </w:pPr>
       <w:r>
-        <w:t xml:space="preserve">Pengujian black box adalah metode pengujian perangkat lunak yang berfokus pada fungsi sistem berdasarkan input dan output tanpa melihat struktur kode program (Uminingsih et al., 2022). Pengujian ini digunakan untuk memastikan setiap fitur berjalan sesuai kebutuhan pengguna. Dalam sistem POS dan online order, pengujian black box dapat dilakukan pada fitur login, pengelolaan produk, transaksi POS, checkout pembeli, verifikasi pembayaran QRIS, perubahan status pesanan, pengurangan stok, pencetakan struk, dan laporan.</w:t>
+        <w:t xml:space="preserve">Pengujian black box adalah metode pengujian perangkat lunak yang berfokus pada fungsi sistem berdasarkan input dan output tanpa melihat struktur kode program (Uminingsih, Ichsanudin, Yusuf, &amp; Suraya, 2022). Pengujian ini digunakan untuk memastikan setiap fitur berjalan sesuai kebutuhan pengguna. Dalam sistem POS dan online order, pengujian black box dapat dilakukan pada fitur login, pengelolaan produk, transaksi POS, checkout pembeli, verifikasi pembayaran QRIS, perubahan status pesanan, pengurangan stok, pencetakan struk, dan laporan.</w:t>
       </w:r>
     </w:p>
     <w:p>
@@ -757,7 +757,1319 @@
         <w:jc w:val="both"/>
       </w:pPr>
       <w:r>
-        <w:t xml:space="preserve">Pada penelitian ini, use case diagram dipakai untuk memetakan interaksi admin, kasir, dan pembeli dengan sistem, sedangkan activity diagram dipakai untuk menggambarkan alur transaksi kasir dan alur pemesanan online beserta verifikasi pembayaran QRIS. Kedua diagram tersebut, beserta entity relationship diagram untuk struktur basis data, disajikan sebagai hasil perancangan pada Bab IV.</w:t>
+        <w:t xml:space="preserve">Pada penelitian ini, use case diagram dipakai untuk memetakan interaksi admin, kasir, dan pembeli dengan sistem, sedangkan activity diagram dipakai untuk menggambarkan alur transaksi kasir dan alur pemesanan online beserta verifikasi pembayaran QRIS. Kedua diagram tersebut, beserta entity relationship diagram untuk struktur basis data, disajikan sebagai hasil perancangan pada Bab III.</w:t>
+      </w:r>
+    </w:p>
+    <w:p>
+      <w:pPr>
+        <w:spacing w:before="200" w:after="80"/>
+        <w:jc w:val="center"/>
+      </w:pPr>
+      <w:r>
+        <w:rPr>
+          <w:rFonts w:ascii="Times New Roman" w:cs="Times New Roman" w:eastAsia="Times New Roman" w:hAnsi="Times New Roman"/>
+          <w:b/>
+          <w:bCs/>
+          <w:sz w:val="24"/>
+          <w:szCs w:val="24"/>
+        </w:rPr>
+        <w:t xml:space="preserve">Tabel 2.2 Simbol Use Case Diagram dan Activity Diagram</w:t>
+      </w:r>
+    </w:p>
+    <w:tbl>
+      <w:tblPr>
+        <w:tblW w:w="7937" w:type="dxa"/>
+        <w:tblBorders>
+          <w:top w:val="single" w:sz="4" w:space="0" w:color="auto"/>
+          <w:left w:val="single" w:sz="4" w:space="0" w:color="auto"/>
+          <w:bottom w:val="single" w:sz="4" w:space="0" w:color="auto"/>
+          <w:right w:val="single" w:sz="4" w:space="0" w:color="auto"/>
+          <w:insideH w:val="single" w:sz="4" w:space="0" w:color="auto"/>
+          <w:insideV w:val="single" w:sz="4" w:space="0" w:color="auto"/>
+        </w:tblBorders>
+        <w:tblCellMar>
+          <w:left w:w="10" w:type="dxa"/>
+          <w:right w:w="10" w:type="dxa"/>
+        </w:tblCellMar>
+        <w:tblLook w:val="0000" w:firstRow="0" w:lastRow="0" w:firstColumn="0" w:lastColumn="0" w:noHBand="0" w:noVBand="0"/>
+      </w:tblPr>
+      <w:tblGrid>
+        <w:gridCol w:w="1600"/>
+        <w:gridCol w:w="1800"/>
+        <w:gridCol w:w="4537"/>
+      </w:tblGrid>
+      <w:tr>
+        <w:trPr>
+          <w:tblHeader/>
+        </w:trPr>
+        <w:tc>
+          <w:tcPr>
+            <w:tcW w:w="1600" w:type="dxa"/>
+            <w:tcMar>
+              <w:top w:w="60" w:type="dxa"/>
+              <w:left w:w="100" w:type="dxa"/>
+              <w:bottom w:w="60" w:type="dxa"/>
+              <w:right w:w="100" w:type="dxa"/>
+            </w:tcMar>
+            <w:vAlign w:val="center"/>
+          </w:tcPr>
+          <w:p>
+            <w:pPr>
+              <w:spacing w:line="276" w:lineRule="auto"/>
+              <w:jc w:val="center"/>
+            </w:pPr>
+            <w:r>
+              <w:rPr>
+                <w:rFonts w:ascii="Times New Roman" w:cs="Times New Roman" w:eastAsia="Times New Roman" w:hAnsi="Times New Roman"/>
+                <w:b/>
+                <w:bCs/>
+                <w:sz w:val="20"/>
+                <w:szCs w:val="20"/>
+              </w:rPr>
+              <w:t xml:space="preserve">Simbol</w:t>
+            </w:r>
+          </w:p>
+        </w:tc>
+        <w:tc>
+          <w:tcPr>
+            <w:tcW w:w="1800" w:type="dxa"/>
+            <w:tcMar>
+              <w:top w:w="60" w:type="dxa"/>
+              <w:left w:w="100" w:type="dxa"/>
+              <w:bottom w:w="60" w:type="dxa"/>
+              <w:right w:w="100" w:type="dxa"/>
+            </w:tcMar>
+            <w:vAlign w:val="center"/>
+          </w:tcPr>
+          <w:p>
+            <w:pPr>
+              <w:spacing w:line="276" w:lineRule="auto"/>
+              <w:jc w:val="center"/>
+            </w:pPr>
+            <w:r>
+              <w:rPr>
+                <w:rFonts w:ascii="Times New Roman" w:cs="Times New Roman" w:eastAsia="Times New Roman" w:hAnsi="Times New Roman"/>
+                <w:b/>
+                <w:bCs/>
+                <w:sz w:val="20"/>
+                <w:szCs w:val="20"/>
+              </w:rPr>
+              <w:t xml:space="preserve">Nama</w:t>
+            </w:r>
+          </w:p>
+        </w:tc>
+        <w:tc>
+          <w:tcPr>
+            <w:tcW w:w="4537" w:type="dxa"/>
+            <w:tcMar>
+              <w:top w:w="60" w:type="dxa"/>
+              <w:left w:w="100" w:type="dxa"/>
+              <w:bottom w:w="60" w:type="dxa"/>
+              <w:right w:w="100" w:type="dxa"/>
+            </w:tcMar>
+            <w:vAlign w:val="center"/>
+          </w:tcPr>
+          <w:p>
+            <w:pPr>
+              <w:spacing w:line="276" w:lineRule="auto"/>
+              <w:jc w:val="center"/>
+            </w:pPr>
+            <w:r>
+              <w:rPr>
+                <w:rFonts w:ascii="Times New Roman" w:cs="Times New Roman" w:eastAsia="Times New Roman" w:hAnsi="Times New Roman"/>
+                <w:b/>
+                <w:bCs/>
+                <w:sz w:val="20"/>
+                <w:szCs w:val="20"/>
+              </w:rPr>
+              <w:t xml:space="preserve">Keterangan</w:t>
+            </w:r>
+          </w:p>
+        </w:tc>
+      </w:tr>
+      <w:tr>
+        <w:trPr>
+          <w:cantSplit/>
+        </w:trPr>
+        <w:tc>
+          <w:tcPr>
+            <w:tcW w:w="1600" w:type="dxa"/>
+            <w:tcMar>
+              <w:top w:w="60" w:type="dxa"/>
+              <w:left w:w="100" w:type="dxa"/>
+              <w:bottom w:w="60" w:type="dxa"/>
+              <w:right w:w="100" w:type="dxa"/>
+            </w:tcMar>
+            <w:vAlign w:val="center"/>
+          </w:tcPr>
+          <w:p>
+            <w:pPr>
+              <w:jc w:val="center"/>
+            </w:pPr>
+            <w:r>
+              <w:rPr>
+                <w:rFonts w:ascii="Times New Roman" w:cs="Times New Roman" w:eastAsia="Times New Roman" w:hAnsi="Times New Roman"/>
+              </w:rPr>
+              <w:drawing>
+                <wp:inline xmlns:wp="http://schemas.openxmlformats.org/drawingml/2006/wordprocessingDrawing" distT="0" distB="0" distL="0" distR="0">
+                  <wp:extent cx="244800" cy="320000"/>
+                  <wp:effectExtent l="0" t="0" r="0" b="0"/>
+                  <wp:docPr id="201" name="Picture 201"/>
+                  <wp:cNvGraphicFramePr xmlns:a="http://schemas.openxmlformats.org/drawingml/2006/main">
+                    <a:graphicFrameLocks xmlns:a="http://schemas.openxmlformats.org/drawingml/2006/main" noChangeAspect="1"/>
+                  </wp:cNvGraphicFramePr>
+                  <a:graphic xmlns:a="http://schemas.openxmlformats.org/drawingml/2006/main">
+                    <a:graphicData uri="http://schemas.openxmlformats.org/drawingml/2006/picture">
+                      <pic:pic xmlns:pic="http://schemas.openxmlformats.org/drawingml/2006/picture">
+                        <pic:nvPicPr>
+                          <pic:cNvPr id="201" name=""/>
+                          <pic:cNvPicPr>
+                            <a:picLocks noChangeAspect="1" noChangeArrowheads="1"/>
+                          </pic:cNvPicPr>
+                        </pic:nvPicPr>
+                        <pic:blipFill>
+                          <a:blip r:embed="rId20"/>
+                          <a:srcRect/>
+                          <a:stretch>
+                            <a:fillRect/>
+                          </a:stretch>
+                        </pic:blipFill>
+                        <pic:spPr bwMode="auto">
+                          <a:xfrm>
+                            <a:off x="0" y="0"/>
+                            <a:ext cx="244800" cy="320000"/>
+                          </a:xfrm>
+                          <a:prstGeom prst="rect">
+                            <a:avLst/>
+                          </a:prstGeom>
+                        </pic:spPr>
+                      </pic:pic>
+                    </a:graphicData>
+                  </a:graphic>
+                </wp:inline>
+              </w:drawing>
+            </w:r>
+          </w:p>
+        </w:tc>
+        <w:tc>
+          <w:tcPr>
+            <w:tcW w:w="1800" w:type="dxa"/>
+            <w:tcMar>
+              <w:top w:w="60" w:type="dxa"/>
+              <w:left w:w="100" w:type="dxa"/>
+              <w:bottom w:w="60" w:type="dxa"/>
+              <w:right w:w="100" w:type="dxa"/>
+            </w:tcMar>
+            <w:vAlign w:val="center"/>
+          </w:tcPr>
+          <w:p>
+            <w:pPr>
+              <w:spacing w:line="276" w:lineRule="auto"/>
+              <w:jc w:val="left"/>
+            </w:pPr>
+            <w:r>
+              <w:rPr>
+                <w:rFonts w:ascii="Times New Roman" w:cs="Times New Roman" w:eastAsia="Times New Roman" w:hAnsi="Times New Roman"/>
+                <w:sz w:val="20"/>
+                <w:szCs w:val="20"/>
+              </w:rPr>
+              <w:t xml:space="preserve">Actor</w:t>
+            </w:r>
+          </w:p>
+        </w:tc>
+        <w:tc>
+          <w:tcPr>
+            <w:tcW w:w="4537" w:type="dxa"/>
+            <w:tcMar>
+              <w:top w:w="60" w:type="dxa"/>
+              <w:left w:w="100" w:type="dxa"/>
+              <w:bottom w:w="60" w:type="dxa"/>
+              <w:right w:w="100" w:type="dxa"/>
+            </w:tcMar>
+            <w:vAlign w:val="center"/>
+          </w:tcPr>
+          <w:p>
+            <w:pPr>
+              <w:spacing w:line="276" w:lineRule="auto"/>
+              <w:jc w:val="left"/>
+            </w:pPr>
+            <w:r>
+              <w:rPr>
+                <w:rFonts w:ascii="Times New Roman" w:cs="Times New Roman" w:eastAsia="Times New Roman" w:hAnsi="Times New Roman"/>
+                <w:sz w:val="20"/>
+                <w:szCs w:val="20"/>
+              </w:rPr>
+              <w:t xml:space="preserve">Menggambarkan peran pengguna yang berinteraksi dengan sistem (admin, kasir, pembeli) pada use case diagram.</w:t>
+            </w:r>
+          </w:p>
+        </w:tc>
+      </w:tr>
+      <w:tr>
+        <w:trPr>
+          <w:cantSplit/>
+        </w:trPr>
+        <w:tc>
+          <w:tcPr>
+            <w:tcW w:w="1600" w:type="dxa"/>
+            <w:tcMar>
+              <w:top w:w="60" w:type="dxa"/>
+              <w:left w:w="100" w:type="dxa"/>
+              <w:bottom w:w="60" w:type="dxa"/>
+              <w:right w:w="100" w:type="dxa"/>
+            </w:tcMar>
+            <w:vAlign w:val="center"/>
+          </w:tcPr>
+          <w:p>
+            <w:pPr>
+              <w:jc w:val="center"/>
+            </w:pPr>
+            <w:r>
+              <w:rPr>
+                <w:rFonts w:ascii="Times New Roman" w:cs="Times New Roman" w:eastAsia="Times New Roman" w:hAnsi="Times New Roman"/>
+              </w:rPr>
+              <w:drawing>
+                <wp:inline xmlns:wp="http://schemas.openxmlformats.org/drawingml/2006/wordprocessingDrawing" distT="0" distB="0" distL="0" distR="0">
+                  <wp:extent cx="573440" cy="320000"/>
+                  <wp:effectExtent l="0" t="0" r="0" b="0"/>
+                  <wp:docPr id="202" name="Picture 202"/>
+                  <wp:cNvGraphicFramePr xmlns:a="http://schemas.openxmlformats.org/drawingml/2006/main">
+                    <a:graphicFrameLocks xmlns:a="http://schemas.openxmlformats.org/drawingml/2006/main" noChangeAspect="1"/>
+                  </wp:cNvGraphicFramePr>
+                  <a:graphic xmlns:a="http://schemas.openxmlformats.org/drawingml/2006/main">
+                    <a:graphicData uri="http://schemas.openxmlformats.org/drawingml/2006/picture">
+                      <pic:pic xmlns:pic="http://schemas.openxmlformats.org/drawingml/2006/picture">
+                        <pic:nvPicPr>
+                          <pic:cNvPr id="202" name=""/>
+                          <pic:cNvPicPr>
+                            <a:picLocks noChangeAspect="1" noChangeArrowheads="1"/>
+                          </pic:cNvPicPr>
+                        </pic:nvPicPr>
+                        <pic:blipFill>
+                          <a:blip r:embed="rId21"/>
+                          <a:srcRect/>
+                          <a:stretch>
+                            <a:fillRect/>
+                          </a:stretch>
+                        </pic:blipFill>
+                        <pic:spPr bwMode="auto">
+                          <a:xfrm>
+                            <a:off x="0" y="0"/>
+                            <a:ext cx="573440" cy="320000"/>
+                          </a:xfrm>
+                          <a:prstGeom prst="rect">
+                            <a:avLst/>
+                          </a:prstGeom>
+                        </pic:spPr>
+                      </pic:pic>
+                    </a:graphicData>
+                  </a:graphic>
+                </wp:inline>
+              </w:drawing>
+            </w:r>
+          </w:p>
+        </w:tc>
+        <w:tc>
+          <w:tcPr>
+            <w:tcW w:w="1800" w:type="dxa"/>
+            <w:tcMar>
+              <w:top w:w="60" w:type="dxa"/>
+              <w:left w:w="100" w:type="dxa"/>
+              <w:bottom w:w="60" w:type="dxa"/>
+              <w:right w:w="100" w:type="dxa"/>
+            </w:tcMar>
+            <w:vAlign w:val="center"/>
+          </w:tcPr>
+          <w:p>
+            <w:pPr>
+              <w:spacing w:line="276" w:lineRule="auto"/>
+              <w:jc w:val="left"/>
+            </w:pPr>
+            <w:r>
+              <w:rPr>
+                <w:rFonts w:ascii="Times New Roman" w:cs="Times New Roman" w:eastAsia="Times New Roman" w:hAnsi="Times New Roman"/>
+                <w:sz w:val="20"/>
+                <w:szCs w:val="20"/>
+              </w:rPr>
+              <w:t xml:space="preserve">Use Case</w:t>
+            </w:r>
+          </w:p>
+        </w:tc>
+        <w:tc>
+          <w:tcPr>
+            <w:tcW w:w="4537" w:type="dxa"/>
+            <w:tcMar>
+              <w:top w:w="60" w:type="dxa"/>
+              <w:left w:w="100" w:type="dxa"/>
+              <w:bottom w:w="60" w:type="dxa"/>
+              <w:right w:w="100" w:type="dxa"/>
+            </w:tcMar>
+            <w:vAlign w:val="center"/>
+          </w:tcPr>
+          <w:p>
+            <w:pPr>
+              <w:spacing w:line="276" w:lineRule="auto"/>
+              <w:jc w:val="left"/>
+            </w:pPr>
+            <w:r>
+              <w:rPr>
+                <w:rFonts w:ascii="Times New Roman" w:cs="Times New Roman" w:eastAsia="Times New Roman" w:hAnsi="Times New Roman"/>
+                <w:sz w:val="20"/>
+                <w:szCs w:val="20"/>
+              </w:rPr>
+              <w:t xml:space="preserve">Menggambarkan satu fungsi atau layanan yang bisa dijalankan aktor terhadap sistem.</w:t>
+            </w:r>
+          </w:p>
+        </w:tc>
+      </w:tr>
+      <w:tr>
+        <w:trPr>
+          <w:cantSplit/>
+        </w:trPr>
+        <w:tc>
+          <w:tcPr>
+            <w:tcW w:w="1600" w:type="dxa"/>
+            <w:tcMar>
+              <w:top w:w="60" w:type="dxa"/>
+              <w:left w:w="100" w:type="dxa"/>
+              <w:bottom w:w="60" w:type="dxa"/>
+              <w:right w:w="100" w:type="dxa"/>
+            </w:tcMar>
+            <w:vAlign w:val="center"/>
+          </w:tcPr>
+          <w:p>
+            <w:pPr>
+              <w:jc w:val="center"/>
+            </w:pPr>
+            <w:r>
+              <w:rPr>
+                <w:rFonts w:ascii="Times New Roman" w:cs="Times New Roman" w:eastAsia="Times New Roman" w:hAnsi="Times New Roman"/>
+              </w:rPr>
+              <w:drawing>
+                <wp:inline xmlns:wp="http://schemas.openxmlformats.org/drawingml/2006/wordprocessingDrawing" distT="0" distB="0" distL="0" distR="0">
+                  <wp:extent cx="455680" cy="320000"/>
+                  <wp:effectExtent l="0" t="0" r="0" b="0"/>
+                  <wp:docPr id="203" name="Picture 203"/>
+                  <wp:cNvGraphicFramePr xmlns:a="http://schemas.openxmlformats.org/drawingml/2006/main">
+                    <a:graphicFrameLocks xmlns:a="http://schemas.openxmlformats.org/drawingml/2006/main" noChangeAspect="1"/>
+                  </wp:cNvGraphicFramePr>
+                  <a:graphic xmlns:a="http://schemas.openxmlformats.org/drawingml/2006/main">
+                    <a:graphicData uri="http://schemas.openxmlformats.org/drawingml/2006/picture">
+                      <pic:pic xmlns:pic="http://schemas.openxmlformats.org/drawingml/2006/picture">
+                        <pic:nvPicPr>
+                          <pic:cNvPr id="203" name=""/>
+                          <pic:cNvPicPr>
+                            <a:picLocks noChangeAspect="1" noChangeArrowheads="1"/>
+                          </pic:cNvPicPr>
+                        </pic:nvPicPr>
+                        <pic:blipFill>
+                          <a:blip r:embed="rId22"/>
+                          <a:srcRect/>
+                          <a:stretch>
+                            <a:fillRect/>
+                          </a:stretch>
+                        </pic:blipFill>
+                        <pic:spPr bwMode="auto">
+                          <a:xfrm>
+                            <a:off x="0" y="0"/>
+                            <a:ext cx="455680" cy="320000"/>
+                          </a:xfrm>
+                          <a:prstGeom prst="rect">
+                            <a:avLst/>
+                          </a:prstGeom>
+                        </pic:spPr>
+                      </pic:pic>
+                    </a:graphicData>
+                  </a:graphic>
+                </wp:inline>
+              </w:drawing>
+            </w:r>
+          </w:p>
+        </w:tc>
+        <w:tc>
+          <w:tcPr>
+            <w:tcW w:w="1800" w:type="dxa"/>
+            <w:tcMar>
+              <w:top w:w="60" w:type="dxa"/>
+              <w:left w:w="100" w:type="dxa"/>
+              <w:bottom w:w="60" w:type="dxa"/>
+              <w:right w:w="100" w:type="dxa"/>
+            </w:tcMar>
+            <w:vAlign w:val="center"/>
+          </w:tcPr>
+          <w:p>
+            <w:pPr>
+              <w:spacing w:line="276" w:lineRule="auto"/>
+              <w:jc w:val="left"/>
+            </w:pPr>
+            <w:r>
+              <w:rPr>
+                <w:rFonts w:ascii="Times New Roman" w:cs="Times New Roman" w:eastAsia="Times New Roman" w:hAnsi="Times New Roman"/>
+                <w:sz w:val="20"/>
+                <w:szCs w:val="20"/>
+              </w:rPr>
+              <w:t xml:space="preserve">System Boundary</w:t>
+            </w:r>
+          </w:p>
+        </w:tc>
+        <w:tc>
+          <w:tcPr>
+            <w:tcW w:w="4537" w:type="dxa"/>
+            <w:tcMar>
+              <w:top w:w="60" w:type="dxa"/>
+              <w:left w:w="100" w:type="dxa"/>
+              <w:bottom w:w="60" w:type="dxa"/>
+              <w:right w:w="100" w:type="dxa"/>
+            </w:tcMar>
+            <w:vAlign w:val="center"/>
+          </w:tcPr>
+          <w:p>
+            <w:pPr>
+              <w:spacing w:line="276" w:lineRule="auto"/>
+              <w:jc w:val="left"/>
+            </w:pPr>
+            <w:r>
+              <w:rPr>
+                <w:rFonts w:ascii="Times New Roman" w:cs="Times New Roman" w:eastAsia="Times New Roman" w:hAnsi="Times New Roman"/>
+                <w:sz w:val="20"/>
+                <w:szCs w:val="20"/>
+              </w:rPr>
+              <w:t xml:space="preserve">Batas sistem yang memisahkan use case di dalamnya dari aktor di luar sistem.</w:t>
+            </w:r>
+          </w:p>
+        </w:tc>
+      </w:tr>
+      <w:tr>
+        <w:trPr>
+          <w:cantSplit/>
+        </w:trPr>
+        <w:tc>
+          <w:tcPr>
+            <w:tcW w:w="1600" w:type="dxa"/>
+            <w:tcMar>
+              <w:top w:w="60" w:type="dxa"/>
+              <w:left w:w="100" w:type="dxa"/>
+              <w:bottom w:w="60" w:type="dxa"/>
+              <w:right w:w="100" w:type="dxa"/>
+            </w:tcMar>
+            <w:vAlign w:val="center"/>
+          </w:tcPr>
+          <w:p>
+            <w:pPr>
+              <w:jc w:val="center"/>
+            </w:pPr>
+            <w:r>
+              <w:rPr>
+                <w:rFonts w:ascii="Times New Roman" w:cs="Times New Roman" w:eastAsia="Times New Roman" w:hAnsi="Times New Roman"/>
+              </w:rPr>
+              <w:drawing>
+                <wp:inline xmlns:wp="http://schemas.openxmlformats.org/drawingml/2006/wordprocessingDrawing" distT="0" distB="0" distL="0" distR="0">
+                  <wp:extent cx="787840" cy="320000"/>
+                  <wp:effectExtent l="0" t="0" r="0" b="0"/>
+                  <wp:docPr id="204" name="Picture 204"/>
+                  <wp:cNvGraphicFramePr xmlns:a="http://schemas.openxmlformats.org/drawingml/2006/main">
+                    <a:graphicFrameLocks xmlns:a="http://schemas.openxmlformats.org/drawingml/2006/main" noChangeAspect="1"/>
+                  </wp:cNvGraphicFramePr>
+                  <a:graphic xmlns:a="http://schemas.openxmlformats.org/drawingml/2006/main">
+                    <a:graphicData uri="http://schemas.openxmlformats.org/drawingml/2006/picture">
+                      <pic:pic xmlns:pic="http://schemas.openxmlformats.org/drawingml/2006/picture">
+                        <pic:nvPicPr>
+                          <pic:cNvPr id="204" name=""/>
+                          <pic:cNvPicPr>
+                            <a:picLocks noChangeAspect="1" noChangeArrowheads="1"/>
+                          </pic:cNvPicPr>
+                        </pic:nvPicPr>
+                        <pic:blipFill>
+                          <a:blip r:embed="rId23"/>
+                          <a:srcRect/>
+                          <a:stretch>
+                            <a:fillRect/>
+                          </a:stretch>
+                        </pic:blipFill>
+                        <pic:spPr bwMode="auto">
+                          <a:xfrm>
+                            <a:off x="0" y="0"/>
+                            <a:ext cx="787840" cy="320000"/>
+                          </a:xfrm>
+                          <a:prstGeom prst="rect">
+                            <a:avLst/>
+                          </a:prstGeom>
+                        </pic:spPr>
+                      </pic:pic>
+                    </a:graphicData>
+                  </a:graphic>
+                </wp:inline>
+              </w:drawing>
+            </w:r>
+          </w:p>
+        </w:tc>
+        <w:tc>
+          <w:tcPr>
+            <w:tcW w:w="1800" w:type="dxa"/>
+            <w:tcMar>
+              <w:top w:w="60" w:type="dxa"/>
+              <w:left w:w="100" w:type="dxa"/>
+              <w:bottom w:w="60" w:type="dxa"/>
+              <w:right w:w="100" w:type="dxa"/>
+            </w:tcMar>
+            <w:vAlign w:val="center"/>
+          </w:tcPr>
+          <w:p>
+            <w:pPr>
+              <w:spacing w:line="276" w:lineRule="auto"/>
+              <w:jc w:val="left"/>
+            </w:pPr>
+            <w:r>
+              <w:rPr>
+                <w:rFonts w:ascii="Times New Roman" w:cs="Times New Roman" w:eastAsia="Times New Roman" w:hAnsi="Times New Roman"/>
+                <w:sz w:val="20"/>
+                <w:szCs w:val="20"/>
+              </w:rPr>
+              <w:t xml:space="preserve">Association</w:t>
+            </w:r>
+          </w:p>
+        </w:tc>
+        <w:tc>
+          <w:tcPr>
+            <w:tcW w:w="4537" w:type="dxa"/>
+            <w:tcMar>
+              <w:top w:w="60" w:type="dxa"/>
+              <w:left w:w="100" w:type="dxa"/>
+              <w:bottom w:w="60" w:type="dxa"/>
+              <w:right w:w="100" w:type="dxa"/>
+            </w:tcMar>
+            <w:vAlign w:val="center"/>
+          </w:tcPr>
+          <w:p>
+            <w:pPr>
+              <w:spacing w:line="276" w:lineRule="auto"/>
+              <w:jc w:val="left"/>
+            </w:pPr>
+            <w:r>
+              <w:rPr>
+                <w:rFonts w:ascii="Times New Roman" w:cs="Times New Roman" w:eastAsia="Times New Roman" w:hAnsi="Times New Roman"/>
+                <w:sz w:val="20"/>
+                <w:szCs w:val="20"/>
+              </w:rPr>
+              <w:t xml:space="preserve">Garis penghubung antara aktor dengan use case yang dijalankannya.</w:t>
+            </w:r>
+          </w:p>
+        </w:tc>
+      </w:tr>
+      <w:tr>
+        <w:trPr>
+          <w:cantSplit/>
+        </w:trPr>
+        <w:tc>
+          <w:tcPr>
+            <w:tcW w:w="1600" w:type="dxa"/>
+            <w:tcMar>
+              <w:top w:w="60" w:type="dxa"/>
+              <w:left w:w="100" w:type="dxa"/>
+              <w:bottom w:w="60" w:type="dxa"/>
+              <w:right w:w="100" w:type="dxa"/>
+            </w:tcMar>
+            <w:vAlign w:val="center"/>
+          </w:tcPr>
+          <w:p>
+            <w:pPr>
+              <w:jc w:val="center"/>
+            </w:pPr>
+            <w:r>
+              <w:rPr>
+                <w:rFonts w:ascii="Times New Roman" w:cs="Times New Roman" w:eastAsia="Times New Roman" w:hAnsi="Times New Roman"/>
+              </w:rPr>
+              <w:drawing>
+                <wp:inline xmlns:wp="http://schemas.openxmlformats.org/drawingml/2006/wordprocessingDrawing" distT="0" distB="0" distL="0" distR="0">
+                  <wp:extent cx="698240" cy="320000"/>
+                  <wp:effectExtent l="0" t="0" r="0" b="0"/>
+                  <wp:docPr id="205" name="Picture 205"/>
+                  <wp:cNvGraphicFramePr xmlns:a="http://schemas.openxmlformats.org/drawingml/2006/main">
+                    <a:graphicFrameLocks xmlns:a="http://schemas.openxmlformats.org/drawingml/2006/main" noChangeAspect="1"/>
+                  </wp:cNvGraphicFramePr>
+                  <a:graphic xmlns:a="http://schemas.openxmlformats.org/drawingml/2006/main">
+                    <a:graphicData uri="http://schemas.openxmlformats.org/drawingml/2006/picture">
+                      <pic:pic xmlns:pic="http://schemas.openxmlformats.org/drawingml/2006/picture">
+                        <pic:nvPicPr>
+                          <pic:cNvPr id="205" name=""/>
+                          <pic:cNvPicPr>
+                            <a:picLocks noChangeAspect="1" noChangeArrowheads="1"/>
+                          </pic:cNvPicPr>
+                        </pic:nvPicPr>
+                        <pic:blipFill>
+                          <a:blip r:embed="rId24"/>
+                          <a:srcRect/>
+                          <a:stretch>
+                            <a:fillRect/>
+                          </a:stretch>
+                        </pic:blipFill>
+                        <pic:spPr bwMode="auto">
+                          <a:xfrm>
+                            <a:off x="0" y="0"/>
+                            <a:ext cx="698240" cy="320000"/>
+                          </a:xfrm>
+                          <a:prstGeom prst="rect">
+                            <a:avLst/>
+                          </a:prstGeom>
+                        </pic:spPr>
+                      </pic:pic>
+                    </a:graphicData>
+                  </a:graphic>
+                </wp:inline>
+              </w:drawing>
+            </w:r>
+          </w:p>
+        </w:tc>
+        <w:tc>
+          <w:tcPr>
+            <w:tcW w:w="1800" w:type="dxa"/>
+            <w:tcMar>
+              <w:top w:w="60" w:type="dxa"/>
+              <w:left w:w="100" w:type="dxa"/>
+              <w:bottom w:w="60" w:type="dxa"/>
+              <w:right w:w="100" w:type="dxa"/>
+            </w:tcMar>
+            <w:vAlign w:val="center"/>
+          </w:tcPr>
+          <w:p>
+            <w:pPr>
+              <w:spacing w:line="276" w:lineRule="auto"/>
+              <w:jc w:val="left"/>
+            </w:pPr>
+            <w:r>
+              <w:rPr>
+                <w:rFonts w:ascii="Times New Roman" w:cs="Times New Roman" w:eastAsia="Times New Roman" w:hAnsi="Times New Roman"/>
+                <w:sz w:val="20"/>
+                <w:szCs w:val="20"/>
+              </w:rPr>
+              <w:t xml:space="preserve">Include / Extend</w:t>
+            </w:r>
+          </w:p>
+        </w:tc>
+        <w:tc>
+          <w:tcPr>
+            <w:tcW w:w="4537" w:type="dxa"/>
+            <w:tcMar>
+              <w:top w:w="60" w:type="dxa"/>
+              <w:left w:w="100" w:type="dxa"/>
+              <w:bottom w:w="60" w:type="dxa"/>
+              <w:right w:w="100" w:type="dxa"/>
+            </w:tcMar>
+            <w:vAlign w:val="center"/>
+          </w:tcPr>
+          <w:p>
+            <w:pPr>
+              <w:spacing w:line="276" w:lineRule="auto"/>
+              <w:jc w:val="left"/>
+            </w:pPr>
+            <w:r>
+              <w:rPr>
+                <w:rFonts w:ascii="Times New Roman" w:cs="Times New Roman" w:eastAsia="Times New Roman" w:hAnsi="Times New Roman"/>
+                <w:sz w:val="20"/>
+                <w:szCs w:val="20"/>
+              </w:rPr>
+              <w:t xml:space="preserve">Panah putus-putus berlabel &lt;&lt;include&gt;&gt; atau &lt;&lt;extend&gt;&gt;, menandakan satu use case menyertakan atau memperluas use case lain.</w:t>
+            </w:r>
+          </w:p>
+        </w:tc>
+      </w:tr>
+      <w:tr>
+        <w:trPr>
+          <w:cantSplit/>
+        </w:trPr>
+        <w:tc>
+          <w:tcPr>
+            <w:tcW w:w="1600" w:type="dxa"/>
+            <w:tcMar>
+              <w:top w:w="60" w:type="dxa"/>
+              <w:left w:w="100" w:type="dxa"/>
+              <w:bottom w:w="60" w:type="dxa"/>
+              <w:right w:w="100" w:type="dxa"/>
+            </w:tcMar>
+            <w:vAlign w:val="center"/>
+          </w:tcPr>
+          <w:p>
+            <w:pPr>
+              <w:jc w:val="center"/>
+            </w:pPr>
+            <w:r>
+              <w:rPr>
+                <w:rFonts w:ascii="Times New Roman" w:cs="Times New Roman" w:eastAsia="Times New Roman" w:hAnsi="Times New Roman"/>
+              </w:rPr>
+              <w:drawing>
+                <wp:inline xmlns:wp="http://schemas.openxmlformats.org/drawingml/2006/wordprocessingDrawing" distT="0" distB="0" distL="0" distR="0">
+                  <wp:extent cx="322240" cy="320000"/>
+                  <wp:effectExtent l="0" t="0" r="0" b="0"/>
+                  <wp:docPr id="206" name="Picture 206"/>
+                  <wp:cNvGraphicFramePr xmlns:a="http://schemas.openxmlformats.org/drawingml/2006/main">
+                    <a:graphicFrameLocks xmlns:a="http://schemas.openxmlformats.org/drawingml/2006/main" noChangeAspect="1"/>
+                  </wp:cNvGraphicFramePr>
+                  <a:graphic xmlns:a="http://schemas.openxmlformats.org/drawingml/2006/main">
+                    <a:graphicData uri="http://schemas.openxmlformats.org/drawingml/2006/picture">
+                      <pic:pic xmlns:pic="http://schemas.openxmlformats.org/drawingml/2006/picture">
+                        <pic:nvPicPr>
+                          <pic:cNvPr id="206" name=""/>
+                          <pic:cNvPicPr>
+                            <a:picLocks noChangeAspect="1" noChangeArrowheads="1"/>
+                          </pic:cNvPicPr>
+                        </pic:nvPicPr>
+                        <pic:blipFill>
+                          <a:blip r:embed="rId25"/>
+                          <a:srcRect/>
+                          <a:stretch>
+                            <a:fillRect/>
+                          </a:stretch>
+                        </pic:blipFill>
+                        <pic:spPr bwMode="auto">
+                          <a:xfrm>
+                            <a:off x="0" y="0"/>
+                            <a:ext cx="322240" cy="320000"/>
+                          </a:xfrm>
+                          <a:prstGeom prst="rect">
+                            <a:avLst/>
+                          </a:prstGeom>
+                        </pic:spPr>
+                      </pic:pic>
+                    </a:graphicData>
+                  </a:graphic>
+                </wp:inline>
+              </w:drawing>
+            </w:r>
+          </w:p>
+        </w:tc>
+        <w:tc>
+          <w:tcPr>
+            <w:tcW w:w="1800" w:type="dxa"/>
+            <w:tcMar>
+              <w:top w:w="60" w:type="dxa"/>
+              <w:left w:w="100" w:type="dxa"/>
+              <w:bottom w:w="60" w:type="dxa"/>
+              <w:right w:w="100" w:type="dxa"/>
+            </w:tcMar>
+            <w:vAlign w:val="center"/>
+          </w:tcPr>
+          <w:p>
+            <w:pPr>
+              <w:spacing w:line="276" w:lineRule="auto"/>
+              <w:jc w:val="left"/>
+            </w:pPr>
+            <w:r>
+              <w:rPr>
+                <w:rFonts w:ascii="Times New Roman" w:cs="Times New Roman" w:eastAsia="Times New Roman" w:hAnsi="Times New Roman"/>
+                <w:sz w:val="20"/>
+                <w:szCs w:val="20"/>
+              </w:rPr>
+              <w:t xml:space="preserve">Initial Node</w:t>
+            </w:r>
+          </w:p>
+        </w:tc>
+        <w:tc>
+          <w:tcPr>
+            <w:tcW w:w="4537" w:type="dxa"/>
+            <w:tcMar>
+              <w:top w:w="60" w:type="dxa"/>
+              <w:left w:w="100" w:type="dxa"/>
+              <w:bottom w:w="60" w:type="dxa"/>
+              <w:right w:w="100" w:type="dxa"/>
+            </w:tcMar>
+            <w:vAlign w:val="center"/>
+          </w:tcPr>
+          <w:p>
+            <w:pPr>
+              <w:spacing w:line="276" w:lineRule="auto"/>
+              <w:jc w:val="left"/>
+            </w:pPr>
+            <w:r>
+              <w:rPr>
+                <w:rFonts w:ascii="Times New Roman" w:cs="Times New Roman" w:eastAsia="Times New Roman" w:hAnsi="Times New Roman"/>
+                <w:sz w:val="20"/>
+                <w:szCs w:val="20"/>
+              </w:rPr>
+              <w:t xml:space="preserve">Titik awal alur pada activity diagram, digambarkan sebagai lingkaran hitam penuh.</w:t>
+            </w:r>
+          </w:p>
+        </w:tc>
+      </w:tr>
+      <w:tr>
+        <w:trPr>
+          <w:cantSplit/>
+        </w:trPr>
+        <w:tc>
+          <w:tcPr>
+            <w:tcW w:w="1600" w:type="dxa"/>
+            <w:tcMar>
+              <w:top w:w="60" w:type="dxa"/>
+              <w:left w:w="100" w:type="dxa"/>
+              <w:bottom w:w="60" w:type="dxa"/>
+              <w:right w:w="100" w:type="dxa"/>
+            </w:tcMar>
+            <w:vAlign w:val="center"/>
+          </w:tcPr>
+          <w:p>
+            <w:pPr>
+              <w:jc w:val="center"/>
+            </w:pPr>
+            <w:r>
+              <w:rPr>
+                <w:rFonts w:ascii="Times New Roman" w:cs="Times New Roman" w:eastAsia="Times New Roman" w:hAnsi="Times New Roman"/>
+              </w:rPr>
+              <w:drawing>
+                <wp:inline xmlns:wp="http://schemas.openxmlformats.org/drawingml/2006/wordprocessingDrawing" distT="0" distB="0" distL="0" distR="0">
+                  <wp:extent cx="321920" cy="320000"/>
+                  <wp:effectExtent l="0" t="0" r="0" b="0"/>
+                  <wp:docPr id="207" name="Picture 207"/>
+                  <wp:cNvGraphicFramePr xmlns:a="http://schemas.openxmlformats.org/drawingml/2006/main">
+                    <a:graphicFrameLocks xmlns:a="http://schemas.openxmlformats.org/drawingml/2006/main" noChangeAspect="1"/>
+                  </wp:cNvGraphicFramePr>
+                  <a:graphic xmlns:a="http://schemas.openxmlformats.org/drawingml/2006/main">
+                    <a:graphicData uri="http://schemas.openxmlformats.org/drawingml/2006/picture">
+                      <pic:pic xmlns:pic="http://schemas.openxmlformats.org/drawingml/2006/picture">
+                        <pic:nvPicPr>
+                          <pic:cNvPr id="207" name=""/>
+                          <pic:cNvPicPr>
+                            <a:picLocks noChangeAspect="1" noChangeArrowheads="1"/>
+                          </pic:cNvPicPr>
+                        </pic:nvPicPr>
+                        <pic:blipFill>
+                          <a:blip r:embed="rId26"/>
+                          <a:srcRect/>
+                          <a:stretch>
+                            <a:fillRect/>
+                          </a:stretch>
+                        </pic:blipFill>
+                        <pic:spPr bwMode="auto">
+                          <a:xfrm>
+                            <a:off x="0" y="0"/>
+                            <a:ext cx="321920" cy="320000"/>
+                          </a:xfrm>
+                          <a:prstGeom prst="rect">
+                            <a:avLst/>
+                          </a:prstGeom>
+                        </pic:spPr>
+                      </pic:pic>
+                    </a:graphicData>
+                  </a:graphic>
+                </wp:inline>
+              </w:drawing>
+            </w:r>
+          </w:p>
+        </w:tc>
+        <w:tc>
+          <w:tcPr>
+            <w:tcW w:w="1800" w:type="dxa"/>
+            <w:tcMar>
+              <w:top w:w="60" w:type="dxa"/>
+              <w:left w:w="100" w:type="dxa"/>
+              <w:bottom w:w="60" w:type="dxa"/>
+              <w:right w:w="100" w:type="dxa"/>
+            </w:tcMar>
+            <w:vAlign w:val="center"/>
+          </w:tcPr>
+          <w:p>
+            <w:pPr>
+              <w:spacing w:line="276" w:lineRule="auto"/>
+              <w:jc w:val="left"/>
+            </w:pPr>
+            <w:r>
+              <w:rPr>
+                <w:rFonts w:ascii="Times New Roman" w:cs="Times New Roman" w:eastAsia="Times New Roman" w:hAnsi="Times New Roman"/>
+                <w:sz w:val="20"/>
+                <w:szCs w:val="20"/>
+              </w:rPr>
+              <w:t xml:space="preserve">Final Node</w:t>
+            </w:r>
+          </w:p>
+        </w:tc>
+        <w:tc>
+          <w:tcPr>
+            <w:tcW w:w="4537" w:type="dxa"/>
+            <w:tcMar>
+              <w:top w:w="60" w:type="dxa"/>
+              <w:left w:w="100" w:type="dxa"/>
+              <w:bottom w:w="60" w:type="dxa"/>
+              <w:right w:w="100" w:type="dxa"/>
+            </w:tcMar>
+            <w:vAlign w:val="center"/>
+          </w:tcPr>
+          <w:p>
+            <w:pPr>
+              <w:spacing w:line="276" w:lineRule="auto"/>
+              <w:jc w:val="left"/>
+            </w:pPr>
+            <w:r>
+              <w:rPr>
+                <w:rFonts w:ascii="Times New Roman" w:cs="Times New Roman" w:eastAsia="Times New Roman" w:hAnsi="Times New Roman"/>
+                <w:sz w:val="20"/>
+                <w:szCs w:val="20"/>
+              </w:rPr>
+              <w:t xml:space="preserve">Titik akhir alur pada activity diagram, digambarkan sebagai lingkaran berlapis.</w:t>
+            </w:r>
+          </w:p>
+        </w:tc>
+      </w:tr>
+      <w:tr>
+        <w:trPr>
+          <w:cantSplit/>
+        </w:trPr>
+        <w:tc>
+          <w:tcPr>
+            <w:tcW w:w="1600" w:type="dxa"/>
+            <w:tcMar>
+              <w:top w:w="60" w:type="dxa"/>
+              <w:left w:w="100" w:type="dxa"/>
+              <w:bottom w:w="60" w:type="dxa"/>
+              <w:right w:w="100" w:type="dxa"/>
+            </w:tcMar>
+            <w:vAlign w:val="center"/>
+          </w:tcPr>
+          <w:p>
+            <w:pPr>
+              <w:jc w:val="center"/>
+            </w:pPr>
+            <w:r>
+              <w:rPr>
+                <w:rFonts w:ascii="Times New Roman" w:cs="Times New Roman" w:eastAsia="Times New Roman" w:hAnsi="Times New Roman"/>
+              </w:rPr>
+              <w:drawing>
+                <wp:inline xmlns:wp="http://schemas.openxmlformats.org/drawingml/2006/wordprocessingDrawing" distT="0" distB="0" distL="0" distR="0">
+                  <wp:extent cx="573440" cy="320000"/>
+                  <wp:effectExtent l="0" t="0" r="0" b="0"/>
+                  <wp:docPr id="208" name="Picture 208"/>
+                  <wp:cNvGraphicFramePr xmlns:a="http://schemas.openxmlformats.org/drawingml/2006/main">
+                    <a:graphicFrameLocks xmlns:a="http://schemas.openxmlformats.org/drawingml/2006/main" noChangeAspect="1"/>
+                  </wp:cNvGraphicFramePr>
+                  <a:graphic xmlns:a="http://schemas.openxmlformats.org/drawingml/2006/main">
+                    <a:graphicData uri="http://schemas.openxmlformats.org/drawingml/2006/picture">
+                      <pic:pic xmlns:pic="http://schemas.openxmlformats.org/drawingml/2006/picture">
+                        <pic:nvPicPr>
+                          <pic:cNvPr id="208" name=""/>
+                          <pic:cNvPicPr>
+                            <a:picLocks noChangeAspect="1" noChangeArrowheads="1"/>
+                          </pic:cNvPicPr>
+                        </pic:nvPicPr>
+                        <pic:blipFill>
+                          <a:blip r:embed="rId27"/>
+                          <a:srcRect/>
+                          <a:stretch>
+                            <a:fillRect/>
+                          </a:stretch>
+                        </pic:blipFill>
+                        <pic:spPr bwMode="auto">
+                          <a:xfrm>
+                            <a:off x="0" y="0"/>
+                            <a:ext cx="573440" cy="320000"/>
+                          </a:xfrm>
+                          <a:prstGeom prst="rect">
+                            <a:avLst/>
+                          </a:prstGeom>
+                        </pic:spPr>
+                      </pic:pic>
+                    </a:graphicData>
+                  </a:graphic>
+                </wp:inline>
+              </w:drawing>
+            </w:r>
+          </w:p>
+        </w:tc>
+        <w:tc>
+          <w:tcPr>
+            <w:tcW w:w="1800" w:type="dxa"/>
+            <w:tcMar>
+              <w:top w:w="60" w:type="dxa"/>
+              <w:left w:w="100" w:type="dxa"/>
+              <w:bottom w:w="60" w:type="dxa"/>
+              <w:right w:w="100" w:type="dxa"/>
+            </w:tcMar>
+            <w:vAlign w:val="center"/>
+          </w:tcPr>
+          <w:p>
+            <w:pPr>
+              <w:spacing w:line="276" w:lineRule="auto"/>
+              <w:jc w:val="left"/>
+            </w:pPr>
+            <w:r>
+              <w:rPr>
+                <w:rFonts w:ascii="Times New Roman" w:cs="Times New Roman" w:eastAsia="Times New Roman" w:hAnsi="Times New Roman"/>
+                <w:sz w:val="20"/>
+                <w:szCs w:val="20"/>
+              </w:rPr>
+              <w:t xml:space="preserve">Activity / Action</w:t>
+            </w:r>
+          </w:p>
+        </w:tc>
+        <w:tc>
+          <w:tcPr>
+            <w:tcW w:w="4537" w:type="dxa"/>
+            <w:tcMar>
+              <w:top w:w="60" w:type="dxa"/>
+              <w:left w:w="100" w:type="dxa"/>
+              <w:bottom w:w="60" w:type="dxa"/>
+              <w:right w:w="100" w:type="dxa"/>
+            </w:tcMar>
+            <w:vAlign w:val="center"/>
+          </w:tcPr>
+          <w:p>
+            <w:pPr>
+              <w:spacing w:line="276" w:lineRule="auto"/>
+              <w:jc w:val="left"/>
+            </w:pPr>
+            <w:r>
+              <w:rPr>
+                <w:rFonts w:ascii="Times New Roman" w:cs="Times New Roman" w:eastAsia="Times New Roman" w:hAnsi="Times New Roman"/>
+                <w:sz w:val="20"/>
+                <w:szCs w:val="20"/>
+              </w:rPr>
+              <w:t xml:space="preserve">Satu langkah proses pada activity diagram, digambarkan sebagai persegi panjang bersudut tumpul.</w:t>
+            </w:r>
+          </w:p>
+        </w:tc>
+      </w:tr>
+      <w:tr>
+        <w:trPr>
+          <w:cantSplit/>
+        </w:trPr>
+        <w:tc>
+          <w:tcPr>
+            <w:tcW w:w="1600" w:type="dxa"/>
+            <w:tcMar>
+              <w:top w:w="60" w:type="dxa"/>
+              <w:left w:w="100" w:type="dxa"/>
+              <w:bottom w:w="60" w:type="dxa"/>
+              <w:right w:w="100" w:type="dxa"/>
+            </w:tcMar>
+            <w:vAlign w:val="center"/>
+          </w:tcPr>
+          <w:p>
+            <w:pPr>
+              <w:jc w:val="center"/>
+            </w:pPr>
+            <w:r>
+              <w:rPr>
+                <w:rFonts w:ascii="Times New Roman" w:cs="Times New Roman" w:eastAsia="Times New Roman" w:hAnsi="Times New Roman"/>
+              </w:rPr>
+              <w:drawing>
+                <wp:inline xmlns:wp="http://schemas.openxmlformats.org/drawingml/2006/wordprocessingDrawing" distT="0" distB="0" distL="0" distR="0">
+                  <wp:extent cx="321600" cy="320000"/>
+                  <wp:effectExtent l="0" t="0" r="0" b="0"/>
+                  <wp:docPr id="209" name="Picture 209"/>
+                  <wp:cNvGraphicFramePr xmlns:a="http://schemas.openxmlformats.org/drawingml/2006/main">
+                    <a:graphicFrameLocks xmlns:a="http://schemas.openxmlformats.org/drawingml/2006/main" noChangeAspect="1"/>
+                  </wp:cNvGraphicFramePr>
+                  <a:graphic xmlns:a="http://schemas.openxmlformats.org/drawingml/2006/main">
+                    <a:graphicData uri="http://schemas.openxmlformats.org/drawingml/2006/picture">
+                      <pic:pic xmlns:pic="http://schemas.openxmlformats.org/drawingml/2006/picture">
+                        <pic:nvPicPr>
+                          <pic:cNvPr id="209" name=""/>
+                          <pic:cNvPicPr>
+                            <a:picLocks noChangeAspect="1" noChangeArrowheads="1"/>
+                          </pic:cNvPicPr>
+                        </pic:nvPicPr>
+                        <pic:blipFill>
+                          <a:blip r:embed="rId28"/>
+                          <a:srcRect/>
+                          <a:stretch>
+                            <a:fillRect/>
+                          </a:stretch>
+                        </pic:blipFill>
+                        <pic:spPr bwMode="auto">
+                          <a:xfrm>
+                            <a:off x="0" y="0"/>
+                            <a:ext cx="321600" cy="320000"/>
+                          </a:xfrm>
+                          <a:prstGeom prst="rect">
+                            <a:avLst/>
+                          </a:prstGeom>
+                        </pic:spPr>
+                      </pic:pic>
+                    </a:graphicData>
+                  </a:graphic>
+                </wp:inline>
+              </w:drawing>
+            </w:r>
+          </w:p>
+        </w:tc>
+        <w:tc>
+          <w:tcPr>
+            <w:tcW w:w="1800" w:type="dxa"/>
+            <w:tcMar>
+              <w:top w:w="60" w:type="dxa"/>
+              <w:left w:w="100" w:type="dxa"/>
+              <w:bottom w:w="60" w:type="dxa"/>
+              <w:right w:w="100" w:type="dxa"/>
+            </w:tcMar>
+            <w:vAlign w:val="center"/>
+          </w:tcPr>
+          <w:p>
+            <w:pPr>
+              <w:spacing w:line="276" w:lineRule="auto"/>
+              <w:jc w:val="left"/>
+            </w:pPr>
+            <w:r>
+              <w:rPr>
+                <w:rFonts w:ascii="Times New Roman" w:cs="Times New Roman" w:eastAsia="Times New Roman" w:hAnsi="Times New Roman"/>
+                <w:sz w:val="20"/>
+                <w:szCs w:val="20"/>
+              </w:rPr>
+              <w:t xml:space="preserve">Decision</w:t>
+            </w:r>
+          </w:p>
+        </w:tc>
+        <w:tc>
+          <w:tcPr>
+            <w:tcW w:w="4537" w:type="dxa"/>
+            <w:tcMar>
+              <w:top w:w="60" w:type="dxa"/>
+              <w:left w:w="100" w:type="dxa"/>
+              <w:bottom w:w="60" w:type="dxa"/>
+              <w:right w:w="100" w:type="dxa"/>
+            </w:tcMar>
+            <w:vAlign w:val="center"/>
+          </w:tcPr>
+          <w:p>
+            <w:pPr>
+              <w:spacing w:line="276" w:lineRule="auto"/>
+              <w:jc w:val="left"/>
+            </w:pPr>
+            <w:r>
+              <w:rPr>
+                <w:rFonts w:ascii="Times New Roman" w:cs="Times New Roman" w:eastAsia="Times New Roman" w:hAnsi="Times New Roman"/>
+                <w:sz w:val="20"/>
+                <w:szCs w:val="20"/>
+              </w:rPr>
+              <w:t xml:space="preserve">Titik percabangan alur berdasarkan suatu kondisi, digambarkan sebagai belah ketupat.</w:t>
+            </w:r>
+          </w:p>
+        </w:tc>
+      </w:tr>
+      <w:tr>
+        <w:trPr>
+          <w:cantSplit/>
+        </w:trPr>
+        <w:tc>
+          <w:tcPr>
+            <w:tcW w:w="1600" w:type="dxa"/>
+            <w:tcMar>
+              <w:top w:w="60" w:type="dxa"/>
+              <w:left w:w="100" w:type="dxa"/>
+              <w:bottom w:w="60" w:type="dxa"/>
+              <w:right w:w="100" w:type="dxa"/>
+            </w:tcMar>
+            <w:vAlign w:val="center"/>
+          </w:tcPr>
+          <w:p>
+            <w:pPr>
+              <w:jc w:val="center"/>
+            </w:pPr>
+            <w:r>
+              <w:rPr>
+                <w:rFonts w:ascii="Times New Roman" w:cs="Times New Roman" w:eastAsia="Times New Roman" w:hAnsi="Times New Roman"/>
+              </w:rPr>
+              <w:drawing>
+                <wp:inline xmlns:wp="http://schemas.openxmlformats.org/drawingml/2006/wordprocessingDrawing" distT="0" distB="0" distL="0" distR="0">
+                  <wp:extent cx="787840" cy="320000"/>
+                  <wp:effectExtent l="0" t="0" r="0" b="0"/>
+                  <wp:docPr id="210" name="Picture 210"/>
+                  <wp:cNvGraphicFramePr xmlns:a="http://schemas.openxmlformats.org/drawingml/2006/main">
+                    <a:graphicFrameLocks xmlns:a="http://schemas.openxmlformats.org/drawingml/2006/main" noChangeAspect="1"/>
+                  </wp:cNvGraphicFramePr>
+                  <a:graphic xmlns:a="http://schemas.openxmlformats.org/drawingml/2006/main">
+                    <a:graphicData uri="http://schemas.openxmlformats.org/drawingml/2006/picture">
+                      <pic:pic xmlns:pic="http://schemas.openxmlformats.org/drawingml/2006/picture">
+                        <pic:nvPicPr>
+                          <pic:cNvPr id="210" name=""/>
+                          <pic:cNvPicPr>
+                            <a:picLocks noChangeAspect="1" noChangeArrowheads="1"/>
+                          </pic:cNvPicPr>
+                        </pic:nvPicPr>
+                        <pic:blipFill>
+                          <a:blip r:embed="rId29"/>
+                          <a:srcRect/>
+                          <a:stretch>
+                            <a:fillRect/>
+                          </a:stretch>
+                        </pic:blipFill>
+                        <pic:spPr bwMode="auto">
+                          <a:xfrm>
+                            <a:off x="0" y="0"/>
+                            <a:ext cx="787840" cy="320000"/>
+                          </a:xfrm>
+                          <a:prstGeom prst="rect">
+                            <a:avLst/>
+                          </a:prstGeom>
+                        </pic:spPr>
+                      </pic:pic>
+                    </a:graphicData>
+                  </a:graphic>
+                </wp:inline>
+              </w:drawing>
+            </w:r>
+          </w:p>
+        </w:tc>
+        <w:tc>
+          <w:tcPr>
+            <w:tcW w:w="1800" w:type="dxa"/>
+            <w:tcMar>
+              <w:top w:w="60" w:type="dxa"/>
+              <w:left w:w="100" w:type="dxa"/>
+              <w:bottom w:w="60" w:type="dxa"/>
+              <w:right w:w="100" w:type="dxa"/>
+            </w:tcMar>
+            <w:vAlign w:val="center"/>
+          </w:tcPr>
+          <w:p>
+            <w:pPr>
+              <w:spacing w:line="276" w:lineRule="auto"/>
+              <w:jc w:val="left"/>
+            </w:pPr>
+            <w:r>
+              <w:rPr>
+                <w:rFonts w:ascii="Times New Roman" w:cs="Times New Roman" w:eastAsia="Times New Roman" w:hAnsi="Times New Roman"/>
+                <w:sz w:val="20"/>
+                <w:szCs w:val="20"/>
+              </w:rPr>
+              <w:t xml:space="preserve">Flow</w:t>
+            </w:r>
+          </w:p>
+        </w:tc>
+        <w:tc>
+          <w:tcPr>
+            <w:tcW w:w="4537" w:type="dxa"/>
+            <w:tcMar>
+              <w:top w:w="60" w:type="dxa"/>
+              <w:left w:w="100" w:type="dxa"/>
+              <w:bottom w:w="60" w:type="dxa"/>
+              <w:right w:w="100" w:type="dxa"/>
+            </w:tcMar>
+            <w:vAlign w:val="center"/>
+          </w:tcPr>
+          <w:p>
+            <w:pPr>
+              <w:spacing w:line="276" w:lineRule="auto"/>
+              <w:jc w:val="left"/>
+            </w:pPr>
+            <w:r>
+              <w:rPr>
+                <w:rFonts w:ascii="Times New Roman" w:cs="Times New Roman" w:eastAsia="Times New Roman" w:hAnsi="Times New Roman"/>
+                <w:sz w:val="20"/>
+                <w:szCs w:val="20"/>
+              </w:rPr>
+              <w:t xml:space="preserve">Panah yang menunjukkan arah perpindahan dari satu elemen ke elemen berikutnya.</w:t>
+            </w:r>
+          </w:p>
+        </w:tc>
+      </w:tr>
+    </w:tbl>
+    <w:p>
+      <w:pPr>
+        <w:spacing w:after="300" w:line="360" w:lineRule="auto"/>
+        <w:jc w:val="both"/>
+      </w:pPr>
+      <w:r>
+        <w:rPr>
+          <w:rFonts w:ascii="Times New Roman" w:cs="Times New Roman" w:eastAsia="Times New Roman" w:hAnsi="Times New Roman"/>
+          <w:sz w:val="24"/>
+          <w:szCs w:val="24"/>
+        </w:rPr>
+        <w:t xml:space="preserve">Simbol-simbol pada Tabel 2.2 dipakai secara konsisten pada seluruh use case diagram dan activity diagram yang disajikan pada Bab III.</w:t>
       </w:r>
     </w:p>
     <w:p>
@@ -2275,6 +3587,607 @@
       <w:pPr>
         <w:spacing w:after="240"/>
       </w:pPr>
+    </w:p>
+    <w:p>
+      <w:pPr>
+        <w:pStyle w:val="Heading1"/>
+        <w:spacing w:after="160" w:before="280" w:line="360" w:lineRule="auto"/>
+        <w:jc w:val="left"/>
+      </w:pPr>
+      <w:r>
+        <w:rPr>
+          <w:rFonts w:ascii="Times New Roman" w:cs="Times New Roman" w:eastAsia="Times New Roman" w:hAnsi="Times New Roman"/>
+          <w:b/>
+          <w:bCs/>
+          <w:sz w:val="24"/>
+          <w:szCs w:val="24"/>
+        </w:rPr>
+        <w:t xml:space="preserve">2.4 Daftar Pustaka</w:t>
+      </w:r>
+    </w:p>
+    <w:p>
+      <w:pPr>
+        <w:spacing w:after="200" w:line="360" w:lineRule="auto"/>
+        <w:jc w:val="both"/>
+      </w:pPr>
+      <w:r>
+        <w:rPr>
+          <w:rFonts w:ascii="Times New Roman" w:cs="Times New Roman" w:eastAsia="Times New Roman" w:hAnsi="Times New Roman"/>
+          <w:sz w:val="24"/>
+          <w:szCs w:val="24"/>
+        </w:rPr>
+        <w:t xml:space="preserve">Daftar pustaka berikut memuat seluruh sumber yang disitasi pada Bab I, Bab II, dan Bab III, disusun alfabetis mengikuti gaya sitasi Harvard.</w:t>
+      </w:r>
+    </w:p>
+    <w:p>
+      <w:pPr>
+        <w:spacing w:after="160" w:line="360" w:lineRule="auto"/>
+        <w:ind w:left="425" w:hanging="425"/>
+        <w:jc w:val="both"/>
+      </w:pPr>
+      <w:r>
+        <w:rPr>
+          <w:rFonts w:ascii="Times New Roman" w:cs="Times New Roman" w:eastAsia="Times New Roman" w:hAnsi="Times New Roman"/>
+          <w:sz w:val="24"/>
+          <w:szCs w:val="24"/>
+        </w:rPr>
+        <w:t xml:space="preserve">Al Azfar, N. A., &amp; Anggita, S. D. (2024). Penerapan Metode Waterfall pada Sistem Informasi E-Rapor. </w:t>
+      </w:r>
+      <w:r>
+        <w:rPr>
+          <w:rFonts w:ascii="Times New Roman" w:cs="Times New Roman" w:eastAsia="Times New Roman" w:hAnsi="Times New Roman"/>
+          <w:i/>
+          <w:iCs/>
+          <w:sz w:val="24"/>
+          <w:szCs w:val="24"/>
+        </w:rPr>
+        <w:t xml:space="preserve">Information System Journal (INFOS)</w:t>
+      </w:r>
+      <w:r>
+        <w:rPr>
+          <w:rFonts w:ascii="Times New Roman" w:cs="Times New Roman" w:eastAsia="Times New Roman" w:hAnsi="Times New Roman"/>
+          <w:sz w:val="24"/>
+          <w:szCs w:val="24"/>
+        </w:rPr>
+        <w:t xml:space="preserve">, 7(1), 45-55. https://doi.org/10.24076/infosjournal.2024v7i01.1582</w:t>
+      </w:r>
+    </w:p>
+    <w:p>
+      <w:pPr>
+        <w:spacing w:after="160" w:line="360" w:lineRule="auto"/>
+        <w:ind w:left="425" w:hanging="425"/>
+        <w:jc w:val="both"/>
+      </w:pPr>
+      <w:r>
+        <w:rPr>
+          <w:rFonts w:ascii="Times New Roman" w:cs="Times New Roman" w:eastAsia="Times New Roman" w:hAnsi="Times New Roman"/>
+          <w:sz w:val="24"/>
+          <w:szCs w:val="24"/>
+        </w:rPr>
+        <w:t xml:space="preserve">Andriasari, S., Nizam, N., Nurhasanah, I. A., &amp; Wulandari, K. S. (2024). Aplikasi Point of Sale untuk Meningkatkan Profitabilitas dan Digitalisasi UMKM. </w:t>
+      </w:r>
+      <w:r>
+        <w:rPr>
+          <w:rFonts w:ascii="Times New Roman" w:cs="Times New Roman" w:eastAsia="Times New Roman" w:hAnsi="Times New Roman"/>
+          <w:i/>
+          <w:iCs/>
+          <w:sz w:val="24"/>
+          <w:szCs w:val="24"/>
+        </w:rPr>
+        <w:t xml:space="preserve">EXPERT: Jurnal Manajemen Sistem Informasi dan Teknologi</w:t>
+      </w:r>
+      <w:r>
+        <w:rPr>
+          <w:rFonts w:ascii="Times New Roman" w:cs="Times New Roman" w:eastAsia="Times New Roman" w:hAnsi="Times New Roman"/>
+          <w:sz w:val="24"/>
+          <w:szCs w:val="24"/>
+        </w:rPr>
+        <w:t xml:space="preserve">, 14(2), 89-96. https://doi.org/10.36448/expert.v14i2.3974</w:t>
+      </w:r>
+    </w:p>
+    <w:p>
+      <w:pPr>
+        <w:spacing w:after="160" w:line="360" w:lineRule="auto"/>
+        <w:ind w:left="425" w:hanging="425"/>
+        <w:jc w:val="both"/>
+      </w:pPr>
+      <w:r>
+        <w:rPr>
+          <w:rFonts w:ascii="Times New Roman" w:cs="Times New Roman" w:eastAsia="Times New Roman" w:hAnsi="Times New Roman"/>
+          <w:sz w:val="24"/>
+          <w:szCs w:val="24"/>
+        </w:rPr>
+        <w:t xml:space="preserve">Andy, F. A. M., &amp; Widiono, S. (2024). Inovasi Teknologi dalam Manajemen Penjualan: Aplikasi Point of Sales Berbasis Web untuk UMKM. </w:t>
+      </w:r>
+      <w:r>
+        <w:rPr>
+          <w:rFonts w:ascii="Times New Roman" w:cs="Times New Roman" w:eastAsia="Times New Roman" w:hAnsi="Times New Roman"/>
+          <w:i/>
+          <w:iCs/>
+          <w:sz w:val="24"/>
+          <w:szCs w:val="24"/>
+        </w:rPr>
+        <w:t xml:space="preserve">Infomatek</w:t>
+      </w:r>
+      <w:r>
+        <w:rPr>
+          <w:rFonts w:ascii="Times New Roman" w:cs="Times New Roman" w:eastAsia="Times New Roman" w:hAnsi="Times New Roman"/>
+          <w:sz w:val="24"/>
+          <w:szCs w:val="24"/>
+        </w:rPr>
+        <w:t xml:space="preserve">, 26(2), 161-174. https://doi.org/10.23969/infomatek.v26i2.19007</w:t>
+      </w:r>
+    </w:p>
+    <w:p>
+      <w:pPr>
+        <w:spacing w:after="160" w:line="360" w:lineRule="auto"/>
+        <w:ind w:left="425" w:hanging="425"/>
+        <w:jc w:val="both"/>
+      </w:pPr>
+      <w:r>
+        <w:rPr>
+          <w:rFonts w:ascii="Times New Roman" w:cs="Times New Roman" w:eastAsia="Times New Roman" w:hAnsi="Times New Roman"/>
+          <w:sz w:val="24"/>
+          <w:szCs w:val="24"/>
+        </w:rPr>
+        <w:t xml:space="preserve">Bank Indonesia. (2026). Quick Response Code Indonesian Standard (QRIS). https://www.bi.go.id/en/fungsi-utama/sistem-pembayaran/ritel/kanal-layanan/qris/default.aspx</w:t>
+      </w:r>
+    </w:p>
+    <w:p>
+      <w:pPr>
+        <w:spacing w:after="160" w:line="360" w:lineRule="auto"/>
+        <w:ind w:left="425" w:hanging="425"/>
+        <w:jc w:val="both"/>
+      </w:pPr>
+      <w:r>
+        <w:rPr>
+          <w:rFonts w:ascii="Times New Roman" w:cs="Times New Roman" w:eastAsia="Times New Roman" w:hAnsi="Times New Roman"/>
+          <w:sz w:val="24"/>
+          <w:szCs w:val="24"/>
+        </w:rPr>
+        <w:t xml:space="preserve">Halawa, A. M., &amp; Kurniawan, W. (2025). Perancangan Sistem Informasi Penjualan (POS) Berbasis Website dengan Metode Agile. </w:t>
+      </w:r>
+      <w:r>
+        <w:rPr>
+          <w:rFonts w:ascii="Times New Roman" w:cs="Times New Roman" w:eastAsia="Times New Roman" w:hAnsi="Times New Roman"/>
+          <w:i/>
+          <w:iCs/>
+          <w:sz w:val="24"/>
+          <w:szCs w:val="24"/>
+        </w:rPr>
+        <w:t xml:space="preserve">JSAI (Journal Scientific and Applied Informatics)</w:t>
+      </w:r>
+      <w:r>
+        <w:rPr>
+          <w:rFonts w:ascii="Times New Roman" w:cs="Times New Roman" w:eastAsia="Times New Roman" w:hAnsi="Times New Roman"/>
+          <w:sz w:val="24"/>
+          <w:szCs w:val="24"/>
+        </w:rPr>
+        <w:t xml:space="preserve">, 8(2), 379-386. https://doi.org/10.36085/jsai.v8i2.8451</w:t>
+      </w:r>
+    </w:p>
+    <w:p>
+      <w:pPr>
+        <w:spacing w:after="160" w:line="360" w:lineRule="auto"/>
+        <w:ind w:left="425" w:hanging="425"/>
+        <w:jc w:val="both"/>
+      </w:pPr>
+      <w:r>
+        <w:rPr>
+          <w:rFonts w:ascii="Times New Roman" w:cs="Times New Roman" w:eastAsia="Times New Roman" w:hAnsi="Times New Roman"/>
+          <w:sz w:val="24"/>
+          <w:szCs w:val="24"/>
+        </w:rPr>
+        <w:t xml:space="preserve">Handayani, T., Gunawan, I., &amp; Taufiq, R. (2020). Rancang Bangun Sistem Informasi Pemesanan Menu Makanan Berbasis Web (Studi Kasus: Restoran Bukit Randu Bandara). </w:t>
+      </w:r>
+      <w:r>
+        <w:rPr>
+          <w:rFonts w:ascii="Times New Roman" w:cs="Times New Roman" w:eastAsia="Times New Roman" w:hAnsi="Times New Roman"/>
+          <w:i/>
+          <w:iCs/>
+          <w:sz w:val="24"/>
+          <w:szCs w:val="24"/>
+        </w:rPr>
+        <w:t xml:space="preserve">Jurnal SITECH: Sistem Informasi dan Teknologi</w:t>
+      </w:r>
+      <w:r>
+        <w:rPr>
+          <w:rFonts w:ascii="Times New Roman" w:cs="Times New Roman" w:eastAsia="Times New Roman" w:hAnsi="Times New Roman"/>
+          <w:sz w:val="24"/>
+          <w:szCs w:val="24"/>
+        </w:rPr>
+        <w:t xml:space="preserve">, 3(1), 21-28. https://doi.org/10.24176/sitech.v3i1.4837</w:t>
+      </w:r>
+    </w:p>
+    <w:p>
+      <w:pPr>
+        <w:spacing w:after="160" w:line="360" w:lineRule="auto"/>
+        <w:ind w:left="425" w:hanging="425"/>
+        <w:jc w:val="both"/>
+      </w:pPr>
+      <w:r>
+        <w:rPr>
+          <w:rFonts w:ascii="Times New Roman" w:cs="Times New Roman" w:eastAsia="Times New Roman" w:hAnsi="Times New Roman"/>
+          <w:sz w:val="24"/>
+          <w:szCs w:val="24"/>
+        </w:rPr>
+        <w:t xml:space="preserve">Ichwanul, M., &amp; Hendri. (2022). Sistem Informasi Point of Sales (POS) Berbasis Web dengan Menggunakan Framework Laravel 8 pada Toko Draquatic. </w:t>
+      </w:r>
+      <w:r>
+        <w:rPr>
+          <w:rFonts w:ascii="Times New Roman" w:cs="Times New Roman" w:eastAsia="Times New Roman" w:hAnsi="Times New Roman"/>
+          <w:i/>
+          <w:iCs/>
+          <w:sz w:val="24"/>
+          <w:szCs w:val="24"/>
+        </w:rPr>
+        <w:t xml:space="preserve">JAIS: Journal of Accounting Information System</w:t>
+      </w:r>
+      <w:r>
+        <w:rPr>
+          <w:rFonts w:ascii="Times New Roman" w:cs="Times New Roman" w:eastAsia="Times New Roman" w:hAnsi="Times New Roman"/>
+          <w:sz w:val="24"/>
+          <w:szCs w:val="24"/>
+        </w:rPr>
+        <w:t xml:space="preserve">, 2(2), 6-11. https://doi.org/10.31294/jais.v2i02.1515</w:t>
+      </w:r>
+    </w:p>
+    <w:p>
+      <w:pPr>
+        <w:spacing w:after="160" w:line="360" w:lineRule="auto"/>
+        <w:ind w:left="425" w:hanging="425"/>
+        <w:jc w:val="both"/>
+      </w:pPr>
+      <w:r>
+        <w:rPr>
+          <w:rFonts w:ascii="Times New Roman" w:cs="Times New Roman" w:eastAsia="Times New Roman" w:hAnsi="Times New Roman"/>
+          <w:sz w:val="24"/>
+          <w:szCs w:val="24"/>
+        </w:rPr>
+        <w:t xml:space="preserve">Kamaluddin, R., Yusuf, H. M., &amp; Prianto, C. (2023). Pengembangan Sistem Manajemen Transaksi dan Stok Barang dengan Pendekatan Agile. </w:t>
+      </w:r>
+      <w:r>
+        <w:rPr>
+          <w:rFonts w:ascii="Times New Roman" w:cs="Times New Roman" w:eastAsia="Times New Roman" w:hAnsi="Times New Roman"/>
+          <w:i/>
+          <w:iCs/>
+          <w:sz w:val="24"/>
+          <w:szCs w:val="24"/>
+        </w:rPr>
+        <w:t xml:space="preserve">Competitive</w:t>
+      </w:r>
+      <w:r>
+        <w:rPr>
+          <w:rFonts w:ascii="Times New Roman" w:cs="Times New Roman" w:eastAsia="Times New Roman" w:hAnsi="Times New Roman"/>
+          <w:sz w:val="24"/>
+          <w:szCs w:val="24"/>
+        </w:rPr>
+        <w:t xml:space="preserve">. https://doi.org/10.36618/competitive.v18i2.4104</w:t>
+      </w:r>
+    </w:p>
+    <w:p>
+      <w:pPr>
+        <w:spacing w:after="160" w:line="360" w:lineRule="auto"/>
+        <w:ind w:left="425" w:hanging="425"/>
+        <w:jc w:val="both"/>
+      </w:pPr>
+      <w:r>
+        <w:rPr>
+          <w:rFonts w:ascii="Times New Roman" w:cs="Times New Roman" w:eastAsia="Times New Roman" w:hAnsi="Times New Roman"/>
+          <w:sz w:val="24"/>
+          <w:szCs w:val="24"/>
+        </w:rPr>
+        <w:t xml:space="preserve">Khairunnisa, G., &amp; Voutama, A. (2024). Penerapan UML dalam Perancangan Sistem Informasi Peminjaman Inventaris Berbasis Web di BEM Fasilkom Unsika. </w:t>
+      </w:r>
+      <w:r>
+        <w:rPr>
+          <w:rFonts w:ascii="Times New Roman" w:cs="Times New Roman" w:eastAsia="Times New Roman" w:hAnsi="Times New Roman"/>
+          <w:i/>
+          <w:iCs/>
+          <w:sz w:val="24"/>
+          <w:szCs w:val="24"/>
+        </w:rPr>
+        <w:t xml:space="preserve">JATI (Jurnal Mahasiswa Teknik Informatika)</w:t>
+      </w:r>
+      <w:r>
+        <w:rPr>
+          <w:rFonts w:ascii="Times New Roman" w:cs="Times New Roman" w:eastAsia="Times New Roman" w:hAnsi="Times New Roman"/>
+          <w:sz w:val="24"/>
+          <w:szCs w:val="24"/>
+        </w:rPr>
+        <w:t xml:space="preserve">, 8(3). https://doi.org/10.36040/jati.v8i3.9538</w:t>
+      </w:r>
+    </w:p>
+    <w:p>
+      <w:pPr>
+        <w:spacing w:after="160" w:line="360" w:lineRule="auto"/>
+        <w:ind w:left="425" w:hanging="425"/>
+        <w:jc w:val="both"/>
+      </w:pPr>
+      <w:r>
+        <w:rPr>
+          <w:rFonts w:ascii="Times New Roman" w:cs="Times New Roman" w:eastAsia="Times New Roman" w:hAnsi="Times New Roman"/>
+          <w:sz w:val="24"/>
+          <w:szCs w:val="24"/>
+        </w:rPr>
+        <w:t xml:space="preserve">Laravel. (2026). Laravel 12.x Documentation: Eloquent, Blade, Authentication, Authorization, Validation, and Routing. https://laravel.com/docs/12.x</w:t>
+      </w:r>
+    </w:p>
+    <w:p>
+      <w:pPr>
+        <w:spacing w:after="160" w:line="360" w:lineRule="auto"/>
+        <w:ind w:left="425" w:hanging="425"/>
+        <w:jc w:val="both"/>
+      </w:pPr>
+      <w:r>
+        <w:rPr>
+          <w:rFonts w:ascii="Times New Roman" w:cs="Times New Roman" w:eastAsia="Times New Roman" w:hAnsi="Times New Roman"/>
+          <w:sz w:val="24"/>
+          <w:szCs w:val="24"/>
+        </w:rPr>
+        <w:t xml:space="preserve">Lathief, F. M., Hasdiana, &amp; Lubis, H. (2023). Perancangan Sistem Point of Sales Multi Payment Berbasis Web Menggunakan Framework Laravel pada UMKM Mr. Boba. </w:t>
+      </w:r>
+      <w:r>
+        <w:rPr>
+          <w:rFonts w:ascii="Times New Roman" w:cs="Times New Roman" w:eastAsia="Times New Roman" w:hAnsi="Times New Roman"/>
+          <w:i/>
+          <w:iCs/>
+          <w:sz w:val="24"/>
+          <w:szCs w:val="24"/>
+        </w:rPr>
+        <w:t xml:space="preserve">Jurnal Ilmu Komputer dan Sistem Informasi</w:t>
+      </w:r>
+      <w:r>
+        <w:rPr>
+          <w:rFonts w:ascii="Times New Roman" w:cs="Times New Roman" w:eastAsia="Times New Roman" w:hAnsi="Times New Roman"/>
+          <w:sz w:val="24"/>
+          <w:szCs w:val="24"/>
+        </w:rPr>
+        <w:t xml:space="preserve">. https://doi.org/10.70340/jirsi.v2i3.72</w:t>
+      </w:r>
+    </w:p>
+    <w:p>
+      <w:pPr>
+        <w:spacing w:after="160" w:line="360" w:lineRule="auto"/>
+        <w:ind w:left="425" w:hanging="425"/>
+        <w:jc w:val="both"/>
+      </w:pPr>
+      <w:r>
+        <w:rPr>
+          <w:rFonts w:ascii="Times New Roman" w:cs="Times New Roman" w:eastAsia="Times New Roman" w:hAnsi="Times New Roman"/>
+          <w:sz w:val="24"/>
+          <w:szCs w:val="24"/>
+        </w:rPr>
+        <w:t xml:space="preserve">Livewire. (2026). Laravel Livewire Documentation. https://livewire.laravel.com/docs</w:t>
+      </w:r>
+    </w:p>
+    <w:p>
+      <w:pPr>
+        <w:spacing w:after="160" w:line="360" w:lineRule="auto"/>
+        <w:ind w:left="425" w:hanging="425"/>
+        <w:jc w:val="both"/>
+      </w:pPr>
+      <w:r>
+        <w:rPr>
+          <w:rFonts w:ascii="Times New Roman" w:cs="Times New Roman" w:eastAsia="Times New Roman" w:hAnsi="Times New Roman"/>
+          <w:sz w:val="24"/>
+          <w:szCs w:val="24"/>
+        </w:rPr>
+        <w:t xml:space="preserve">Mulyana, D. I., Imantara, A. G., &amp; Bashir, A. A. (2025). Pengembangan Sistem POS Terintegrasi QRIS pada UMKM IDN Jonggol Jawa Barat. </w:t>
+      </w:r>
+      <w:r>
+        <w:rPr>
+          <w:rFonts w:ascii="Times New Roman" w:cs="Times New Roman" w:eastAsia="Times New Roman" w:hAnsi="Times New Roman"/>
+          <w:i/>
+          <w:iCs/>
+          <w:sz w:val="24"/>
+          <w:szCs w:val="24"/>
+        </w:rPr>
+        <w:t xml:space="preserve">INTECOMS: Journal of Information Technology and Computer Science</w:t>
+      </w:r>
+      <w:r>
+        <w:rPr>
+          <w:rFonts w:ascii="Times New Roman" w:cs="Times New Roman" w:eastAsia="Times New Roman" w:hAnsi="Times New Roman"/>
+          <w:sz w:val="24"/>
+          <w:szCs w:val="24"/>
+        </w:rPr>
+        <w:t xml:space="preserve">. https://doi.org/10.31539/kbgspw64</w:t>
+      </w:r>
+    </w:p>
+    <w:p>
+      <w:pPr>
+        <w:spacing w:after="160" w:line="360" w:lineRule="auto"/>
+        <w:ind w:left="425" w:hanging="425"/>
+        <w:jc w:val="both"/>
+      </w:pPr>
+      <w:r>
+        <w:rPr>
+          <w:rFonts w:ascii="Times New Roman" w:cs="Times New Roman" w:eastAsia="Times New Roman" w:hAnsi="Times New Roman"/>
+          <w:sz w:val="24"/>
+          <w:szCs w:val="24"/>
+        </w:rPr>
+        <w:t xml:space="preserve">Oracle. (2026). MySQL 8.4 Reference Manual. https://dev.mysql.com/doc/refman/8.4/en/</w:t>
+      </w:r>
+    </w:p>
+    <w:p>
+      <w:pPr>
+        <w:spacing w:after="160" w:line="360" w:lineRule="auto"/>
+        <w:ind w:left="425" w:hanging="425"/>
+        <w:jc w:val="both"/>
+      </w:pPr>
+      <w:r>
+        <w:rPr>
+          <w:rFonts w:ascii="Times New Roman" w:cs="Times New Roman" w:eastAsia="Times New Roman" w:hAnsi="Times New Roman"/>
+          <w:sz w:val="24"/>
+          <w:szCs w:val="24"/>
+        </w:rPr>
+        <w:t xml:space="preserve">Rahmadhani, D. I., &amp; Maryam. (2024). Pengembangan Sistem Point of Sale Berbasis Web pada Toko Faafoo Menggunakan Framework Laravel. </w:t>
+      </w:r>
+      <w:r>
+        <w:rPr>
+          <w:rFonts w:ascii="Times New Roman" w:cs="Times New Roman" w:eastAsia="Times New Roman" w:hAnsi="Times New Roman"/>
+          <w:i/>
+          <w:iCs/>
+          <w:sz w:val="24"/>
+          <w:szCs w:val="24"/>
+        </w:rPr>
+        <w:t xml:space="preserve">Methomika: Jurnal Manajemen Informatika &amp; Komputerisasi Akuntansi</w:t>
+      </w:r>
+      <w:r>
+        <w:rPr>
+          <w:rFonts w:ascii="Times New Roman" w:cs="Times New Roman" w:eastAsia="Times New Roman" w:hAnsi="Times New Roman"/>
+          <w:sz w:val="24"/>
+          <w:szCs w:val="24"/>
+        </w:rPr>
+        <w:t xml:space="preserve">, 8(2), 241-249. https://doi.org/10.46880/jmika.Vol8No2.pp241-249</w:t>
+      </w:r>
+    </w:p>
+    <w:p>
+      <w:pPr>
+        <w:spacing w:after="160" w:line="360" w:lineRule="auto"/>
+        <w:ind w:left="425" w:hanging="425"/>
+        <w:jc w:val="both"/>
+      </w:pPr>
+      <w:r>
+        <w:rPr>
+          <w:rFonts w:ascii="Times New Roman" w:cs="Times New Roman" w:eastAsia="Times New Roman" w:hAnsi="Times New Roman"/>
+          <w:sz w:val="24"/>
+          <w:szCs w:val="24"/>
+        </w:rPr>
+        <w:t xml:space="preserve">Razzaq, F. S., &amp; Jatmiko, A. R. (2026). Applying Rapid Application Development to Develop and Evaluate a Laravel Filament-Based Point of Sale System for MSMEs. </w:t>
+      </w:r>
+      <w:r>
+        <w:rPr>
+          <w:rFonts w:ascii="Times New Roman" w:cs="Times New Roman" w:eastAsia="Times New Roman" w:hAnsi="Times New Roman"/>
+          <w:i/>
+          <w:iCs/>
+          <w:sz w:val="24"/>
+          <w:szCs w:val="24"/>
+        </w:rPr>
+        <w:t xml:space="preserve">SMATIKA Jurnal</w:t>
+      </w:r>
+      <w:r>
+        <w:rPr>
+          <w:rFonts w:ascii="Times New Roman" w:cs="Times New Roman" w:eastAsia="Times New Roman" w:hAnsi="Times New Roman"/>
+          <w:sz w:val="24"/>
+          <w:szCs w:val="24"/>
+        </w:rPr>
+        <w:t xml:space="preserve">. https://doi.org/10.32664/smatika.v16i01.2177</w:t>
+      </w:r>
+    </w:p>
+    <w:p>
+      <w:pPr>
+        <w:spacing w:after="160" w:line="360" w:lineRule="auto"/>
+        <w:ind w:left="425" w:hanging="425"/>
+        <w:jc w:val="both"/>
+      </w:pPr>
+      <w:r>
+        <w:rPr>
+          <w:rFonts w:ascii="Times New Roman" w:cs="Times New Roman" w:eastAsia="Times New Roman" w:hAnsi="Times New Roman"/>
+          <w:sz w:val="24"/>
+          <w:szCs w:val="24"/>
+        </w:rPr>
+        <w:t xml:space="preserve">Sihaloho, J. E., Ramadani, A., &amp; Rahmayanti, S. (2020). Implementasi Sistem Pembayaran Quick Response Indonesia Standard Bagi Perkembangan UMKM di Medan. </w:t>
+      </w:r>
+      <w:r>
+        <w:rPr>
+          <w:rFonts w:ascii="Times New Roman" w:cs="Times New Roman" w:eastAsia="Times New Roman" w:hAnsi="Times New Roman"/>
+          <w:i/>
+          <w:iCs/>
+          <w:sz w:val="24"/>
+          <w:szCs w:val="24"/>
+        </w:rPr>
+        <w:t xml:space="preserve">Jurnal Manajemen Bisnis</w:t>
+      </w:r>
+      <w:r>
+        <w:rPr>
+          <w:rFonts w:ascii="Times New Roman" w:cs="Times New Roman" w:eastAsia="Times New Roman" w:hAnsi="Times New Roman"/>
+          <w:sz w:val="24"/>
+          <w:szCs w:val="24"/>
+        </w:rPr>
+        <w:t xml:space="preserve">, 17(2), 287-297. https://doi.org/10.38043/jmb.v17i2.2384</w:t>
+      </w:r>
+    </w:p>
+    <w:p>
+      <w:pPr>
+        <w:spacing w:after="160" w:line="360" w:lineRule="auto"/>
+        <w:ind w:left="425" w:hanging="425"/>
+        <w:jc w:val="both"/>
+      </w:pPr>
+      <w:r>
+        <w:rPr>
+          <w:rFonts w:ascii="Times New Roman" w:cs="Times New Roman" w:eastAsia="Times New Roman" w:hAnsi="Times New Roman"/>
+          <w:sz w:val="24"/>
+          <w:szCs w:val="24"/>
+        </w:rPr>
+        <w:t xml:space="preserve">Spatie. (2026). Laravel Permission Documentation. https://spatie.be/docs/laravel-permission</w:t>
+      </w:r>
+    </w:p>
+    <w:p>
+      <w:pPr>
+        <w:spacing w:after="160" w:line="360" w:lineRule="auto"/>
+        <w:ind w:left="425" w:hanging="425"/>
+        <w:jc w:val="both"/>
+      </w:pPr>
+      <w:r>
+        <w:rPr>
+          <w:rFonts w:ascii="Times New Roman" w:cs="Times New Roman" w:eastAsia="Times New Roman" w:hAnsi="Times New Roman"/>
+          <w:sz w:val="24"/>
+          <w:szCs w:val="24"/>
+        </w:rPr>
+        <w:t xml:space="preserve">Uminingsih, Ichsanudin, M. N., Yusuf, M., &amp; Suraya. (2022). Pengujian Fungsional Perangkat Lunak Sistem Informasi Perpustakaan dengan Metode Black Box Testing Bagi Pemula. </w:t>
+      </w:r>
+      <w:r>
+        <w:rPr>
+          <w:rFonts w:ascii="Times New Roman" w:cs="Times New Roman" w:eastAsia="Times New Roman" w:hAnsi="Times New Roman"/>
+          <w:i/>
+          <w:iCs/>
+          <w:sz w:val="24"/>
+          <w:szCs w:val="24"/>
+        </w:rPr>
+        <w:t xml:space="preserve">STORAGE: Jurnal Ilmiah Teknik dan Ilmu Komputer</w:t>
+      </w:r>
+      <w:r>
+        <w:rPr>
+          <w:rFonts w:ascii="Times New Roman" w:cs="Times New Roman" w:eastAsia="Times New Roman" w:hAnsi="Times New Roman"/>
+          <w:sz w:val="24"/>
+          <w:szCs w:val="24"/>
+        </w:rPr>
+        <w:t xml:space="preserve">, 1(2). https://doi.org/10.55123/storage.v1i2.270</w:t>
+      </w:r>
+    </w:p>
+    <w:p>
+      <w:pPr>
+        <w:spacing w:after="160" w:line="360" w:lineRule="auto"/>
+        <w:ind w:left="425" w:hanging="425"/>
+        <w:jc w:val="both"/>
+      </w:pPr>
+      <w:r>
+        <w:rPr>
+          <w:rFonts w:ascii="Times New Roman" w:cs="Times New Roman" w:eastAsia="Times New Roman" w:hAnsi="Times New Roman"/>
+          <w:sz w:val="24"/>
+          <w:szCs w:val="24"/>
+        </w:rPr>
+        <w:t xml:space="preserve">Yuda, D. C. P., Irawan, A. S. Y., &amp; Nurkifli, E. H. (2024). Rancang Bangun Sistem Point of Sales Berbasis Web Menggunakan Framework Laravel pada Percetakan Radjawali Digital Printing. </w:t>
+      </w:r>
+      <w:r>
+        <w:rPr>
+          <w:rFonts w:ascii="Times New Roman" w:cs="Times New Roman" w:eastAsia="Times New Roman" w:hAnsi="Times New Roman"/>
+          <w:i/>
+          <w:iCs/>
+          <w:sz w:val="24"/>
+          <w:szCs w:val="24"/>
+        </w:rPr>
+        <w:t xml:space="preserve">Jurnal Informatika dan Teknik Elektro Terapan</w:t>
+      </w:r>
+      <w:r>
+        <w:rPr>
+          <w:rFonts w:ascii="Times New Roman" w:cs="Times New Roman" w:eastAsia="Times New Roman" w:hAnsi="Times New Roman"/>
+          <w:sz w:val="24"/>
+          <w:szCs w:val="24"/>
+        </w:rPr>
+        <w:t xml:space="preserve">, 12(3). https://doi.org/10.23960/jitet.v12i3.4773</w:t>
+      </w:r>
     </w:p>
     <w:sectPr>
       <w:pgSz w:w="11906" w:h="16838"/>

</xml_diff>